<commit_message>
Replace template and enforce format preservation
</commit_message>
<xml_diff>
--- a/communication-fee-reimbursement-organizer/assets/templates/通讯费第1季度.docx
+++ b/communication-fee-reimbursement-organizer/assets/templates/通讯费第1季度.docx
@@ -62,23 +62,6 @@
         <w:gridCol w:w="1185"/>
       </w:tblGrid>
       <w:tr>
-        <w:tblPrEx>
-          <w:tblBorders>
-            <w:top w:val="none" w:color="auto" w:sz="0" w:space="0"/>
-            <w:left w:val="none" w:color="auto" w:sz="0" w:space="0"/>
-            <w:bottom w:val="none" w:color="auto" w:sz="0" w:space="0"/>
-            <w:right w:val="none" w:color="auto" w:sz="0" w:space="0"/>
-            <w:insideH w:val="none" w:color="auto" w:sz="0" w:space="0"/>
-            <w:insideV w:val="none" w:color="auto" w:sz="0" w:space="0"/>
-          </w:tblBorders>
-          <w:shd w:val="clear" w:color="auto" w:fill="auto"/>
-          <w:tblCellMar>
-            <w:top w:w="0" w:type="dxa"/>
-            <w:left w:w="108" w:type="dxa"/>
-            <w:bottom w:w="0" w:type="dxa"/>
-            <w:right w:w="108" w:type="dxa"/>
-          </w:tblCellMar>
-        </w:tblPrEx>
         <w:trPr>
           <w:trHeight w:val="862" w:hRule="atLeast"/>
         </w:trPr>
@@ -633,23 +616,6 @@
         </w:tc>
       </w:tr>
       <w:tr>
-        <w:tblPrEx>
-          <w:tblBorders>
-            <w:top w:val="none" w:color="auto" w:sz="0" w:space="0"/>
-            <w:left w:val="none" w:color="auto" w:sz="0" w:space="0"/>
-            <w:bottom w:val="none" w:color="auto" w:sz="0" w:space="0"/>
-            <w:right w:val="none" w:color="auto" w:sz="0" w:space="0"/>
-            <w:insideH w:val="none" w:color="auto" w:sz="0" w:space="0"/>
-            <w:insideV w:val="none" w:color="auto" w:sz="0" w:space="0"/>
-          </w:tblBorders>
-          <w:shd w:val="clear" w:color="auto" w:fill="auto"/>
-          <w:tblCellMar>
-            <w:top w:w="0" w:type="dxa"/>
-            <w:left w:w="108" w:type="dxa"/>
-            <w:bottom w:w="0" w:type="dxa"/>
-            <w:right w:w="108" w:type="dxa"/>
-          </w:tblCellMar>
-        </w:tblPrEx>
         <w:trPr>
           <w:trHeight w:val="298" w:hRule="atLeast"/>
         </w:trPr>
@@ -1002,23 +968,6 @@
         </w:tc>
       </w:tr>
       <w:tr>
-        <w:tblPrEx>
-          <w:tblBorders>
-            <w:top w:val="none" w:color="auto" w:sz="0" w:space="0"/>
-            <w:left w:val="none" w:color="auto" w:sz="0" w:space="0"/>
-            <w:bottom w:val="none" w:color="auto" w:sz="0" w:space="0"/>
-            <w:right w:val="none" w:color="auto" w:sz="0" w:space="0"/>
-            <w:insideH w:val="none" w:color="auto" w:sz="0" w:space="0"/>
-            <w:insideV w:val="none" w:color="auto" w:sz="0" w:space="0"/>
-          </w:tblBorders>
-          <w:shd w:val="clear" w:color="auto" w:fill="auto"/>
-          <w:tblCellMar>
-            <w:top w:w="0" w:type="dxa"/>
-            <w:left w:w="108" w:type="dxa"/>
-            <w:bottom w:w="0" w:type="dxa"/>
-            <w:right w:w="108" w:type="dxa"/>
-          </w:tblCellMar>
-        </w:tblPrEx>
         <w:trPr>
           <w:trHeight w:val="298" w:hRule="atLeast"/>
         </w:trPr>
@@ -1327,23 +1276,6 @@
         </w:tc>
       </w:tr>
       <w:tr>
-        <w:tblPrEx>
-          <w:tblBorders>
-            <w:top w:val="none" w:color="auto" w:sz="0" w:space="0"/>
-            <w:left w:val="none" w:color="auto" w:sz="0" w:space="0"/>
-            <w:bottom w:val="none" w:color="auto" w:sz="0" w:space="0"/>
-            <w:right w:val="none" w:color="auto" w:sz="0" w:space="0"/>
-            <w:insideH w:val="none" w:color="auto" w:sz="0" w:space="0"/>
-            <w:insideV w:val="none" w:color="auto" w:sz="0" w:space="0"/>
-          </w:tblBorders>
-          <w:shd w:val="clear" w:color="auto" w:fill="auto"/>
-          <w:tblCellMar>
-            <w:top w:w="0" w:type="dxa"/>
-            <w:left w:w="108" w:type="dxa"/>
-            <w:bottom w:w="0" w:type="dxa"/>
-            <w:right w:w="108" w:type="dxa"/>
-          </w:tblCellMar>
-        </w:tblPrEx>
         <w:trPr>
           <w:trHeight w:val="298" w:hRule="atLeast"/>
         </w:trPr>
@@ -1652,23 +1584,6 @@
         </w:tc>
       </w:tr>
       <w:tr>
-        <w:tblPrEx>
-          <w:tblBorders>
-            <w:top w:val="none" w:color="auto" w:sz="0" w:space="0"/>
-            <w:left w:val="none" w:color="auto" w:sz="0" w:space="0"/>
-            <w:bottom w:val="none" w:color="auto" w:sz="0" w:space="0"/>
-            <w:right w:val="none" w:color="auto" w:sz="0" w:space="0"/>
-            <w:insideH w:val="none" w:color="auto" w:sz="0" w:space="0"/>
-            <w:insideV w:val="none" w:color="auto" w:sz="0" w:space="0"/>
-          </w:tblBorders>
-          <w:shd w:val="clear" w:color="auto" w:fill="auto"/>
-          <w:tblCellMar>
-            <w:top w:w="0" w:type="dxa"/>
-            <w:left w:w="108" w:type="dxa"/>
-            <w:bottom w:w="0" w:type="dxa"/>
-            <w:right w:w="108" w:type="dxa"/>
-          </w:tblCellMar>
-        </w:tblPrEx>
         <w:trPr>
           <w:trHeight w:val="298" w:hRule="atLeast"/>
         </w:trPr>
@@ -2022,23 +1937,6 @@
         </w:tc>
       </w:tr>
       <w:tr>
-        <w:tblPrEx>
-          <w:tblBorders>
-            <w:top w:val="none" w:color="auto" w:sz="0" w:space="0"/>
-            <w:left w:val="none" w:color="auto" w:sz="0" w:space="0"/>
-            <w:bottom w:val="none" w:color="auto" w:sz="0" w:space="0"/>
-            <w:right w:val="none" w:color="auto" w:sz="0" w:space="0"/>
-            <w:insideH w:val="none" w:color="auto" w:sz="0" w:space="0"/>
-            <w:insideV w:val="none" w:color="auto" w:sz="0" w:space="0"/>
-          </w:tblBorders>
-          <w:shd w:val="clear" w:color="auto" w:fill="auto"/>
-          <w:tblCellMar>
-            <w:top w:w="0" w:type="dxa"/>
-            <w:left w:w="108" w:type="dxa"/>
-            <w:bottom w:w="0" w:type="dxa"/>
-            <w:right w:w="108" w:type="dxa"/>
-          </w:tblCellMar>
-        </w:tblPrEx>
         <w:trPr>
           <w:trHeight w:val="298" w:hRule="atLeast"/>
         </w:trPr>
@@ -2348,23 +2246,6 @@
         </w:tc>
       </w:tr>
       <w:tr>
-        <w:tblPrEx>
-          <w:tblBorders>
-            <w:top w:val="none" w:color="auto" w:sz="0" w:space="0"/>
-            <w:left w:val="none" w:color="auto" w:sz="0" w:space="0"/>
-            <w:bottom w:val="none" w:color="auto" w:sz="0" w:space="0"/>
-            <w:right w:val="none" w:color="auto" w:sz="0" w:space="0"/>
-            <w:insideH w:val="none" w:color="auto" w:sz="0" w:space="0"/>
-            <w:insideV w:val="none" w:color="auto" w:sz="0" w:space="0"/>
-          </w:tblBorders>
-          <w:shd w:val="clear" w:color="auto" w:fill="auto"/>
-          <w:tblCellMar>
-            <w:top w:w="0" w:type="dxa"/>
-            <w:left w:w="108" w:type="dxa"/>
-            <w:bottom w:w="0" w:type="dxa"/>
-            <w:right w:w="108" w:type="dxa"/>
-          </w:tblCellMar>
-        </w:tblPrEx>
         <w:trPr>
           <w:trHeight w:val="298" w:hRule="atLeast"/>
         </w:trPr>
@@ -2674,23 +2555,6 @@
         </w:tc>
       </w:tr>
       <w:tr>
-        <w:tblPrEx>
-          <w:tblBorders>
-            <w:top w:val="none" w:color="auto" w:sz="0" w:space="0"/>
-            <w:left w:val="none" w:color="auto" w:sz="0" w:space="0"/>
-            <w:bottom w:val="none" w:color="auto" w:sz="0" w:space="0"/>
-            <w:right w:val="none" w:color="auto" w:sz="0" w:space="0"/>
-            <w:insideH w:val="none" w:color="auto" w:sz="0" w:space="0"/>
-            <w:insideV w:val="none" w:color="auto" w:sz="0" w:space="0"/>
-          </w:tblBorders>
-          <w:shd w:val="clear" w:color="auto" w:fill="auto"/>
-          <w:tblCellMar>
-            <w:top w:w="0" w:type="dxa"/>
-            <w:left w:w="108" w:type="dxa"/>
-            <w:bottom w:w="0" w:type="dxa"/>
-            <w:right w:w="108" w:type="dxa"/>
-          </w:tblCellMar>
-        </w:tblPrEx>
         <w:trPr>
           <w:trHeight w:val="580" w:hRule="atLeast"/>
         </w:trPr>
@@ -2903,8 +2767,6 @@
           <w:lang w:val="en-US" w:eastAsia="zh-CN"/>
         </w:rPr>
       </w:pPr>
-      <w:bookmarkStart w:id="0" w:name="_GoBack"/>
-      <w:bookmarkEnd w:id="0"/>
     </w:p>
     <w:p>
       <w:pPr>
@@ -2951,367 +2813,6 @@
         <w:t xml:space="preserve">                                            人力行政中心</w:t>
       </w:r>
     </w:p>
-    <w:tbl>
-      <w:tblPr>
-        <w:tblStyle w:val="5"/>
-        <w:tblpPr w:leftFromText="180" w:rightFromText="180" w:vertAnchor="text" w:horzAnchor="page" w:tblpX="825" w:tblpY="1012"/>
-        <w:tblOverlap w:val="never"/>
-        <w:tblW w:w="10398" w:type="dxa"/>
-        <w:jc w:val="center"/>
-        <w:tblBorders>
-          <w:top w:val="single" w:color="auto" w:sz="4" w:space="0"/>
-          <w:left w:val="single" w:color="auto" w:sz="4" w:space="0"/>
-          <w:bottom w:val="single" w:color="auto" w:sz="4" w:space="0"/>
-          <w:right w:val="single" w:color="auto" w:sz="4" w:space="0"/>
-          <w:insideH w:val="single" w:color="auto" w:sz="4" w:space="0"/>
-          <w:insideV w:val="single" w:color="auto" w:sz="4" w:space="0"/>
-        </w:tblBorders>
-        <w:tblLayout w:type="fixed"/>
-        <w:tblCellMar>
-          <w:top w:w="0" w:type="dxa"/>
-          <w:left w:w="108" w:type="dxa"/>
-          <w:bottom w:w="0" w:type="dxa"/>
-          <w:right w:w="108" w:type="dxa"/>
-        </w:tblCellMar>
-      </w:tblPr>
-      <w:tblGrid>
-        <w:gridCol w:w="1676"/>
-        <w:gridCol w:w="3496"/>
-        <w:gridCol w:w="1955"/>
-        <w:gridCol w:w="3271"/>
-      </w:tblGrid>
-      <w:tr>
-        <w:tblPrEx>
-          <w:tblBorders>
-            <w:top w:val="single" w:color="auto" w:sz="4" w:space="0"/>
-            <w:left w:val="single" w:color="auto" w:sz="4" w:space="0"/>
-            <w:bottom w:val="single" w:color="auto" w:sz="4" w:space="0"/>
-            <w:right w:val="single" w:color="auto" w:sz="4" w:space="0"/>
-            <w:insideH w:val="single" w:color="auto" w:sz="4" w:space="0"/>
-            <w:insideV w:val="single" w:color="auto" w:sz="4" w:space="0"/>
-          </w:tblBorders>
-          <w:tblCellMar>
-            <w:top w:w="0" w:type="dxa"/>
-            <w:left w:w="108" w:type="dxa"/>
-            <w:bottom w:w="0" w:type="dxa"/>
-            <w:right w:w="108" w:type="dxa"/>
-          </w:tblCellMar>
-        </w:tblPrEx>
-        <w:trPr>
-          <w:trHeight w:val="1075" w:hRule="atLeast"/>
-          <w:jc w:val="center"/>
-        </w:trPr>
-        <w:tc>
-          <w:tcPr>
-            <w:tcW w:w="1676" w:type="dxa"/>
-            <w:vAlign w:val="center"/>
-          </w:tcPr>
-          <w:p>
-            <w:pPr>
-              <w:jc w:val="center"/>
-              <w:rPr>
-                <w:rFonts w:hint="eastAsia" w:ascii="仿宋" w:hAnsi="仿宋" w:eastAsia="仿宋" w:cs="仿宋"/>
-                <w:sz w:val="28"/>
-                <w:szCs w:val="28"/>
-                <w:lang w:val="en-US" w:eastAsia="zh-CN"/>
-              </w:rPr>
-            </w:pPr>
-            <w:r>
-              <w:rPr>
-                <w:rFonts w:hint="eastAsia" w:ascii="仿宋" w:hAnsi="仿宋" w:eastAsia="仿宋" w:cs="仿宋"/>
-                <w:spacing w:val="70"/>
-                <w:kern w:val="0"/>
-                <w:sz w:val="28"/>
-                <w:szCs w:val="28"/>
-                <w:fitText w:val="1120" w:id="906195498"/>
-                <w:lang w:val="en-US" w:eastAsia="zh-CN"/>
-              </w:rPr>
-              <w:t>经办</w:t>
-            </w:r>
-            <w:r>
-              <w:rPr>
-                <w:rFonts w:hint="eastAsia" w:ascii="仿宋" w:hAnsi="仿宋" w:eastAsia="仿宋" w:cs="仿宋"/>
-                <w:spacing w:val="0"/>
-                <w:kern w:val="0"/>
-                <w:sz w:val="28"/>
-                <w:szCs w:val="28"/>
-                <w:fitText w:val="1120" w:id="906195498"/>
-                <w:lang w:val="en-US" w:eastAsia="zh-CN"/>
-              </w:rPr>
-              <w:t>人</w:t>
-            </w:r>
-          </w:p>
-        </w:tc>
-        <w:tc>
-          <w:tcPr>
-            <w:tcW w:w="3496" w:type="dxa"/>
-            <w:vAlign w:val="center"/>
-          </w:tcPr>
-          <w:p>
-            <w:pPr>
-              <w:jc w:val="both"/>
-              <w:rPr>
-                <w:rFonts w:hint="default" w:ascii="仿宋" w:hAnsi="仿宋" w:eastAsia="仿宋" w:cs="仿宋"/>
-                <w:sz w:val="28"/>
-                <w:szCs w:val="28"/>
-                <w:lang w:val="en-US" w:eastAsia="zh-CN"/>
-              </w:rPr>
-            </w:pPr>
-          </w:p>
-        </w:tc>
-        <w:tc>
-          <w:tcPr>
-            <w:tcW w:w="1955" w:type="dxa"/>
-            <w:vAlign w:val="center"/>
-          </w:tcPr>
-          <w:p>
-            <w:pPr>
-              <w:jc w:val="both"/>
-              <w:rPr>
-                <w:rFonts w:hint="eastAsia" w:ascii="仿宋" w:hAnsi="仿宋" w:eastAsia="仿宋" w:cs="仿宋"/>
-                <w:sz w:val="28"/>
-                <w:szCs w:val="28"/>
-                <w:lang w:val="en-US" w:eastAsia="zh-CN"/>
-              </w:rPr>
-            </w:pPr>
-            <w:r>
-              <w:rPr>
-                <w:rFonts w:hint="eastAsia" w:ascii="仿宋" w:hAnsi="仿宋" w:eastAsia="仿宋" w:cs="仿宋"/>
-                <w:spacing w:val="79"/>
-                <w:w w:val="100"/>
-                <w:kern w:val="0"/>
-                <w:sz w:val="28"/>
-                <w:szCs w:val="28"/>
-                <w:fitText w:val="1596" w:id="425658599"/>
-                <w:lang w:val="en-US" w:eastAsia="zh-CN"/>
-              </w:rPr>
-              <w:t>部门经</w:t>
-            </w:r>
-            <w:r>
-              <w:rPr>
-                <w:rFonts w:hint="eastAsia" w:ascii="仿宋" w:hAnsi="仿宋" w:eastAsia="仿宋" w:cs="仿宋"/>
-                <w:spacing w:val="1"/>
-                <w:w w:val="100"/>
-                <w:kern w:val="0"/>
-                <w:sz w:val="28"/>
-                <w:szCs w:val="28"/>
-                <w:fitText w:val="1596" w:id="425658599"/>
-                <w:lang w:val="en-US" w:eastAsia="zh-CN"/>
-              </w:rPr>
-              <w:t>理</w:t>
-            </w:r>
-          </w:p>
-        </w:tc>
-        <w:tc>
-          <w:tcPr>
-            <w:tcW w:w="3271" w:type="dxa"/>
-            <w:vAlign w:val="center"/>
-          </w:tcPr>
-          <w:p>
-            <w:pPr>
-              <w:jc w:val="both"/>
-              <w:rPr>
-                <w:rFonts w:hint="eastAsia" w:ascii="仿宋" w:hAnsi="仿宋" w:eastAsia="仿宋" w:cs="仿宋"/>
-                <w:sz w:val="28"/>
-                <w:szCs w:val="28"/>
-                <w:lang w:val="en-US" w:eastAsia="zh-CN"/>
-              </w:rPr>
-            </w:pPr>
-          </w:p>
-        </w:tc>
-      </w:tr>
-      <w:tr>
-        <w:tblPrEx>
-          <w:tblBorders>
-            <w:top w:val="single" w:color="auto" w:sz="4" w:space="0"/>
-            <w:left w:val="single" w:color="auto" w:sz="4" w:space="0"/>
-            <w:bottom w:val="single" w:color="auto" w:sz="4" w:space="0"/>
-            <w:right w:val="single" w:color="auto" w:sz="4" w:space="0"/>
-            <w:insideH w:val="single" w:color="auto" w:sz="4" w:space="0"/>
-            <w:insideV w:val="single" w:color="auto" w:sz="4" w:space="0"/>
-          </w:tblBorders>
-          <w:tblCellMar>
-            <w:top w:w="0" w:type="dxa"/>
-            <w:left w:w="108" w:type="dxa"/>
-            <w:bottom w:w="0" w:type="dxa"/>
-            <w:right w:w="108" w:type="dxa"/>
-          </w:tblCellMar>
-        </w:tblPrEx>
-        <w:trPr>
-          <w:trHeight w:val="1075" w:hRule="atLeast"/>
-          <w:jc w:val="center"/>
-        </w:trPr>
-        <w:tc>
-          <w:tcPr>
-            <w:tcW w:w="1676" w:type="dxa"/>
-            <w:vAlign w:val="center"/>
-          </w:tcPr>
-          <w:p>
-            <w:pPr>
-              <w:jc w:val="center"/>
-              <w:rPr>
-                <w:rFonts w:hint="eastAsia" w:ascii="仿宋" w:hAnsi="仿宋" w:eastAsia="仿宋" w:cs="仿宋"/>
-                <w:sz w:val="28"/>
-                <w:szCs w:val="28"/>
-                <w:lang w:val="en-US" w:eastAsia="zh-CN"/>
-              </w:rPr>
-            </w:pPr>
-            <w:r>
-              <w:rPr>
-                <w:rFonts w:hint="eastAsia" w:ascii="仿宋" w:hAnsi="仿宋" w:eastAsia="仿宋" w:cs="仿宋"/>
-                <w:sz w:val="28"/>
-                <w:szCs w:val="28"/>
-                <w:lang w:val="en-US" w:eastAsia="zh-CN"/>
-              </w:rPr>
-              <w:t>主管领导</w:t>
-            </w:r>
-          </w:p>
-        </w:tc>
-        <w:tc>
-          <w:tcPr>
-            <w:tcW w:w="3496" w:type="dxa"/>
-            <w:vAlign w:val="center"/>
-          </w:tcPr>
-          <w:p>
-            <w:pPr>
-              <w:jc w:val="both"/>
-              <w:rPr>
-                <w:rFonts w:hint="eastAsia" w:ascii="仿宋" w:hAnsi="仿宋" w:eastAsia="仿宋" w:cs="仿宋"/>
-                <w:sz w:val="28"/>
-                <w:szCs w:val="28"/>
-                <w:lang w:val="en-US" w:eastAsia="zh-CN"/>
-              </w:rPr>
-            </w:pPr>
-          </w:p>
-        </w:tc>
-        <w:tc>
-          <w:tcPr>
-            <w:tcW w:w="1955" w:type="dxa"/>
-            <w:vAlign w:val="center"/>
-          </w:tcPr>
-          <w:p>
-            <w:pPr>
-              <w:jc w:val="both"/>
-              <w:rPr>
-                <w:rFonts w:hint="eastAsia" w:ascii="仿宋" w:hAnsi="仿宋" w:eastAsia="仿宋" w:cs="仿宋"/>
-                <w:sz w:val="28"/>
-                <w:szCs w:val="28"/>
-                <w:lang w:val="en-US" w:eastAsia="zh-CN"/>
-              </w:rPr>
-            </w:pPr>
-            <w:r>
-              <w:rPr>
-                <w:rFonts w:hint="eastAsia" w:ascii="仿宋" w:hAnsi="仿宋" w:eastAsia="仿宋" w:cs="仿宋"/>
-                <w:spacing w:val="189"/>
-                <w:w w:val="100"/>
-                <w:kern w:val="0"/>
-                <w:sz w:val="28"/>
-                <w:szCs w:val="28"/>
-                <w:fitText w:val="1596" w:id="802774841"/>
-                <w:lang w:val="en-US" w:eastAsia="zh-CN"/>
-              </w:rPr>
-              <w:t>总经</w:t>
-            </w:r>
-            <w:r>
-              <w:rPr>
-                <w:rFonts w:hint="eastAsia" w:ascii="仿宋" w:hAnsi="仿宋" w:eastAsia="仿宋" w:cs="仿宋"/>
-                <w:spacing w:val="0"/>
-                <w:w w:val="100"/>
-                <w:kern w:val="0"/>
-                <w:sz w:val="28"/>
-                <w:szCs w:val="28"/>
-                <w:fitText w:val="1596" w:id="802774841"/>
-                <w:lang w:val="en-US" w:eastAsia="zh-CN"/>
-              </w:rPr>
-              <w:t>理</w:t>
-            </w:r>
-          </w:p>
-        </w:tc>
-        <w:tc>
-          <w:tcPr>
-            <w:tcW w:w="3271" w:type="dxa"/>
-            <w:vAlign w:val="center"/>
-          </w:tcPr>
-          <w:p>
-            <w:pPr>
-              <w:jc w:val="both"/>
-              <w:rPr>
-                <w:rFonts w:hint="eastAsia" w:ascii="仿宋" w:hAnsi="仿宋" w:eastAsia="仿宋" w:cs="仿宋"/>
-                <w:sz w:val="28"/>
-                <w:szCs w:val="28"/>
-                <w:lang w:val="en-US" w:eastAsia="zh-CN"/>
-              </w:rPr>
-            </w:pPr>
-          </w:p>
-        </w:tc>
-      </w:tr>
-      <w:tr>
-        <w:tblPrEx>
-          <w:tblBorders>
-            <w:top w:val="single" w:color="auto" w:sz="4" w:space="0"/>
-            <w:left w:val="single" w:color="auto" w:sz="4" w:space="0"/>
-            <w:bottom w:val="single" w:color="auto" w:sz="4" w:space="0"/>
-            <w:right w:val="single" w:color="auto" w:sz="4" w:space="0"/>
-            <w:insideH w:val="single" w:color="auto" w:sz="4" w:space="0"/>
-            <w:insideV w:val="single" w:color="auto" w:sz="4" w:space="0"/>
-          </w:tblBorders>
-          <w:tblCellMar>
-            <w:top w:w="0" w:type="dxa"/>
-            <w:left w:w="108" w:type="dxa"/>
-            <w:bottom w:w="0" w:type="dxa"/>
-            <w:right w:w="108" w:type="dxa"/>
-          </w:tblCellMar>
-        </w:tblPrEx>
-        <w:trPr>
-          <w:trHeight w:val="1123" w:hRule="atLeast"/>
-          <w:jc w:val="center"/>
-        </w:trPr>
-        <w:tc>
-          <w:tcPr>
-            <w:tcW w:w="1676" w:type="dxa"/>
-            <w:vAlign w:val="center"/>
-          </w:tcPr>
-          <w:p>
-            <w:pPr>
-              <w:jc w:val="center"/>
-              <w:rPr>
-                <w:rFonts w:hint="default" w:ascii="仿宋" w:hAnsi="仿宋" w:eastAsia="仿宋" w:cs="仿宋"/>
-                <w:sz w:val="28"/>
-                <w:szCs w:val="28"/>
-                <w:lang w:val="en-US" w:eastAsia="zh-CN"/>
-              </w:rPr>
-            </w:pPr>
-            <w:r>
-              <w:rPr>
-                <w:rFonts w:hint="eastAsia" w:ascii="仿宋" w:hAnsi="仿宋" w:eastAsia="仿宋" w:cs="仿宋"/>
-                <w:sz w:val="28"/>
-                <w:szCs w:val="28"/>
-                <w:lang w:val="en-US" w:eastAsia="zh-CN"/>
-              </w:rPr>
-              <w:t>董事长</w:t>
-            </w:r>
-          </w:p>
-        </w:tc>
-        <w:tc>
-          <w:tcPr>
-            <w:tcW w:w="8722" w:type="dxa"/>
-            <w:gridSpan w:val="3"/>
-            <w:vAlign w:val="center"/>
-          </w:tcPr>
-          <w:p>
-            <w:pPr>
-              <w:jc w:val="both"/>
-              <w:rPr>
-                <w:rFonts w:hint="eastAsia" w:ascii="仿宋" w:hAnsi="仿宋" w:eastAsia="仿宋" w:cs="仿宋"/>
-                <w:sz w:val="28"/>
-                <w:szCs w:val="28"/>
-                <w:lang w:val="en-US" w:eastAsia="zh-CN"/>
-              </w:rPr>
-            </w:pPr>
-          </w:p>
-        </w:tc>
-      </w:tr>
-    </w:tbl>
     <w:p>
       <w:pPr>
         <w:keepNext w:val="0"/>
@@ -3341,6 +2842,8 @@
           <w:lang w:val="en-US" w:eastAsia="zh-CN"/>
         </w:rPr>
       </w:pPr>
+      <w:bookmarkStart w:id="0" w:name="_GoBack"/>
+      <w:bookmarkEnd w:id="0"/>
       <w:r>
         <w:rPr>
           <w:rFonts w:hint="eastAsia" w:ascii="仿宋" w:hAnsi="仿宋" w:eastAsia="仿宋" w:cs="仿宋"/>
@@ -3350,19 +2853,6 @@
         </w:rPr>
         <w:t>2025年7月12日</w:t>
       </w:r>
-    </w:p>
-    <w:p>
-      <w:pPr>
-        <w:tabs>
-          <w:tab w:val="left" w:pos="1001"/>
-        </w:tabs>
-        <w:bidi w:val="0"/>
-        <w:jc w:val="both"/>
-        <w:rPr>
-          <w:rFonts w:hint="default" w:ascii="楷体" w:hAnsi="楷体" w:eastAsia="楷体" w:cs="楷体"/>
-          <w:lang w:val="en-US" w:eastAsia="zh-CN"/>
-        </w:rPr>
-      </w:pPr>
     </w:p>
     <w:sectPr>
       <w:headerReference r:id="rId3" w:type="default"/>
@@ -3401,7 +2891,7 @@
               <wp:extent cx="1828800" cy="1828800"/>
               <wp:effectExtent l="0" t="0" r="0" b="0"/>
               <wp:wrapNone/>
-              <wp:docPr id="1" name="文本框 1"/>
+              <wp:docPr id="4" name="文本框 4"/>
               <wp:cNvGraphicFramePr/>
               <a:graphic xmlns:a="http://schemas.openxmlformats.org/drawingml/2006/main">
                 <a:graphicData uri="http://schemas.microsoft.com/office/word/2010/wordprocessingShape">
@@ -3469,7 +2959,7 @@
         </mc:Choice>
         <mc:Fallback>
           <w:pict>
-            <v:shape id="_x0000_s1026" o:spid="_x0000_s1026" o:spt="202" type="#_x0000_t202" style="position:absolute;left:0pt;margin-top:0pt;height:144pt;width:144pt;mso-position-horizontal:center;mso-position-horizontal-relative:margin;mso-wrap-style:none;z-index:251660288;mso-width-relative:page;mso-height-relative:page;" filled="f" stroked="f" coordsize="21600,21600" o:gfxdata="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">
+            <v:shape id="_x0000_s1026" o:spid="_x0000_s1026" o:spt="202" type="#_x0000_t202" style="position:absolute;left:0pt;margin-top:0pt;height:144pt;width:144pt;mso-position-horizontal:center;mso-position-horizontal-relative:margin;mso-wrap-style:none;z-index:251660288;mso-width-relative:page;mso-height-relative:page;" filled="f" stroked="f" coordsize="21600,21600" o:gfxdata="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">
               <v:fill on="f" focussize="0,0"/>
               <v:stroke on="f" weight="0.5pt"/>
               <v:imagedata o:title=""/>
@@ -3543,9 +3033,9 @@
                 <wp:posOffset>441325</wp:posOffset>
               </wp:positionV>
               <wp:extent cx="5981700" cy="0"/>
-              <wp:effectExtent l="0" t="0" r="0" b="0"/>
+              <wp:effectExtent l="0" t="6350" r="0" b="6350"/>
               <wp:wrapNone/>
-              <wp:docPr id="12" name="直接连接符 12"/>
+              <wp:docPr id="2" name="直接连接符 2"/>
               <wp:cNvGraphicFramePr/>
               <a:graphic xmlns:a="http://schemas.openxmlformats.org/drawingml/2006/main">
                 <a:graphicData uri="http://schemas.microsoft.com/office/word/2010/wordprocessingShape">
@@ -3588,7 +3078,7 @@
         </mc:Choice>
         <mc:Fallback>
           <w:pict>
-            <v:line id="_x0000_s1026" o:spid="_x0000_s1026" o:spt="20" style="position:absolute;left:0pt;margin-left:-3.95pt;margin-top:34.75pt;height:0pt;width:471pt;z-index:251659264;mso-width-relative:page;mso-height-relative:page;" filled="f" stroked="t" coordsize="21600,21600" o:gfxdata="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">
+            <v:line id="_x0000_s1026" o:spid="_x0000_s1026" o:spt="20" style="position:absolute;left:0pt;margin-left:-3.95pt;margin-top:34.75pt;height:0pt;width:471pt;z-index:251659264;mso-width-relative:page;mso-height-relative:page;" filled="f" stroked="t" coordsize="21600,21600" o:gfxdata="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">
               <v:fill on="f" focussize="0,0"/>
               <v:stroke weight="0.25pt" color="#000000 [3213]" miterlimit="8" joinstyle="miter"/>
               <v:imagedata o:title=""/>
@@ -3608,7 +3098,7 @@
         <wp:inline distT="0" distB="0" distL="114300" distR="114300">
           <wp:extent cx="1262380" cy="414020"/>
           <wp:effectExtent l="0" t="0" r="2540" b="12700"/>
-          <wp:docPr id="14" name="图片 14" descr="力量logo 透明"/>
+          <wp:docPr id="3" name="图片 3" descr="力量logo 透明"/>
           <wp:cNvGraphicFramePr>
             <a:graphicFrameLocks xmlns:a="http://schemas.openxmlformats.org/drawingml/2006/main" noChangeAspect="1"/>
           </wp:cNvGraphicFramePr>
@@ -3616,7 +3106,7 @@
             <a:graphicData uri="http://schemas.openxmlformats.org/drawingml/2006/picture">
               <pic:pic xmlns:pic="http://schemas.openxmlformats.org/drawingml/2006/picture">
                 <pic:nvPicPr>
-                  <pic:cNvPr id="14" name="图片 14" descr="力量logo 透明"/>
+                  <pic:cNvPr id="3" name="图片 3" descr="力量logo 透明"/>
                   <pic:cNvPicPr>
                     <a:picLocks noChangeAspect="1"/>
                   </pic:cNvPicPr>

</xml_diff>